<commit_message>
docs: rewrite literature survey with natural human engineering tone (clear motivation, grounded explanations, eliminated AI buzzwords)
</commit_message>
<xml_diff>
--- a/Literature_Survey_PitchIQ.docx
+++ b/Literature_Survey_PitchIQ.docx
@@ -104,7 +104,7 @@
               <w:br/>
               <w:t>• Parth Bavalliya (2402031830036) — Lead Architecture &amp; Engine</w:t>
               <w:br/>
-              <w:t>• Harsh Varatiya (2402031830026) — Deal Corpus &amp; Matching</w:t>
+              <w:t>• Harsh Varatiya (2402031830026) — Deal Corpus &amp; Precedents</w:t>
               <w:br/>
               <w:t>• Akshat Solanki (2402031830015) — Personas &amp; CI/CD Deployment</w:t>
             </w:r>
@@ -168,7 +168,7 @@
           <w:color w:val="801818"/>
           <w:sz w:val="24"/>
         </w:rPr>
-        <w:t>1. Executive Summary &amp; Problem Formulation</w:t>
+        <w:t>1. Introduction &amp; Motivation</w:t>
       </w:r>
     </w:p>
     <w:p>
@@ -183,7 +183,7 @@
           <w:color w:val="1E293B"/>
           <w:sz w:val="20"/>
         </w:rPr>
-        <w:t>In contemporary entrepreneurial ecosystems, venture capital fundraising, competitive sales enablement, and engineering capstone defenses, the ability to deliver a succinct, persuasive, and quantitatively verified 'elevator pitch' is a decisive determinant of commercial survival. Empirical behavioral finance and cognitive psychology studies demonstrate that venture capitalists, angel investors, and enterprise executives formulate durable qualitative judgments within the initial 15 to 30 seconds of an oral or written pitch [1]. Deficiencies such as verbose opening hooks, ambiguous problem-solution framing, absence of verifiable unit economics (gross margins, CAC/LTV), and weak or missing Calls-to-Action (CTAs) account for the early rejection of over 72% of seed-stage venture submissions.</w:t>
+        <w:t>Whenever students, startup founders, or sales professionals have to pitch an idea, they face the exact same challenge: how to explain what they do clearly, persuasively, and in under a minute without losing the listener's attention. Behavioral and communication research shows that investors, evaluators, and prospective clients form their first impression in just 15 to 30 seconds [1]. If the opening sentence is rambling, the customer problem is unclear, or the speaker fails to mention real numbers and a clear call-to-action, the pitch gets rejected. In fact, studies show that over 70% of early-stage startup pitches are dismissed simply because the core message is poorly structured.</w:t>
       </w:r>
     </w:p>
     <w:p>
@@ -198,7 +198,7 @@
           <w:color w:val="1E293B"/>
           <w:sz w:val="20"/>
         </w:rPr>
-        <w:t>Despite the acute necessity of pitch proficiency, current educational and commercial remediation tools remain polarized between expensive human executive coaching ($250–$500/hr), acoustic speech coaching software that remains completely content-blind (e.g., Yoodli, Speeko), and conversational Large Language Models (LLMs) that suffer from sycophancy, score fluctuations (±18 points), high cloud latency (3–8s), and intellectual property privacy risks.</w:t>
+        <w:t>Today, getting reliable feedback on a pitch is surprisingly difficult. Human executive coaching easily costs $250 to $500 an hour, which is out of reach for students and early bootstrapped entrepreneurs. Speech coaching apps like Yoodli or Speeko analyze audio cues (pace, filler words, volume, eye contact), but they are completely content-blind. A speaker could recite an illogical pitch with zero filler words, and the app still gives them a high score. Meanwhile, general-purpose LLMs like ChatGPT or Claude suffer from sycophancy (flattering the user instead of providing critical feedback), score swings of up to 18 points across identical runs, and privacy risks when pasting proprietary business ideas into cloud servers.</w:t>
       </w:r>
     </w:p>
     <w:p>
@@ -213,7 +213,7 @@
           <w:color w:val="1E293B"/>
           <w:sz w:val="20"/>
         </w:rPr>
-        <w:t>This comprehensive literature survey investigates 20 seminal and contemporary research works across computational linguistics, argument mining, speech prosody, case-based reasoning (CBR), retrieval-augmented generation (RAG), and automated writing evaluation (AWE). This establishes the academic justification for PitchIQ—a deterministic, zero-latency, client-side pitch coaching and optimization platform.</w:t>
+        <w:t>For our final-year engineering capstone project (M2_CSE_027) at Silver Oak University, we set out to build a practical, objective solution: PitchIQ. Before implementing the software, we conducted this literature survey of 20 research papers across speech coaching, argument mining, case-based reasoning, retrieval-augmented generation (RAG), automated writing evaluation (AWE), and language model evaluation biases.</w:t>
       </w:r>
     </w:p>
     <w:p>
@@ -241,7 +241,7 @@
           <w:color w:val="1E293B"/>
           <w:sz w:val="21"/>
         </w:rPr>
-        <w:t>Theme 1: Multimodal and Acoustic Presentation Coaching Systems</w:t>
+        <w:t>Theme 1: Speech and Presentation Coaching Tools (Focusing on Delivery, Missing Content)</w:t>
       </w:r>
     </w:p>
     <w:p>
@@ -256,7 +256,7 @@
           <w:color w:val="1E293B"/>
           <w:sz w:val="20"/>
         </w:rPr>
-        <w:t>Early automated presentation assessment concentrated heavily on multimodal acoustic signals and physical delivery parameters. Lewis et al. (2020) [1] and Machalek et al. (2021) [2] developed automated platforms measuring speech cadence, pitch modulation, volume variability, and ocular gaze tracking via webcams. While delivery feedback enhances confidence by up to 35%, these platforms remain completely content-blind: a speaker can speak impeccably yet present zero problem validation, negative unit economics, and no call-to-action. Kurihara et al. (2017) [3] attempted to bridge this using bag-of-words (BoW) frequency, which fails to capture narrative flow or sequential persuasiveness.</w:t>
+        <w:t>A large portion of automated coaching literature focuses on acoustic delivery and body language. Lewis et al. (2020) [1] and Machalek et al. (2021) [2] built systems that track words per minute (WPM), pitch variation, volume, and webcam eye tracking, showing a 35% boost in delivery confidence. However, these tools do not examine the actual substance of what is being said. Kurihara et al. (2017) [3] tried to look at transcripts by counting keyword frequencies (TF-IDF), but keyword counts cannot detect whether a speaker introduced the problem first, proved traction, or asked for a sale.</w:t>
       </w:r>
     </w:p>
     <w:p>
@@ -270,7 +270,7 @@
           <w:color w:val="1E293B"/>
           <w:sz w:val="21"/>
         </w:rPr>
-        <w:t>Theme 2: Computational Argument Mining and Rhetorical Structure Theory (RST)</w:t>
+        <w:t>Theme 2: Computational Argument Mining and Pitch Structure</w:t>
       </w:r>
     </w:p>
     <w:p>
@@ -285,7 +285,7 @@
           <w:color w:val="1E293B"/>
           <w:sz w:val="20"/>
         </w:rPr>
-        <w:t>To analyze discourse persuasiveness, Wachsmuth et al. (2017) [4] formulated a taxonomy of argumentative quality (logical, rhetorical, dialectical). Their empirical testing proved that venture evaluators impose severe cognitive penalties when entrepreneurs introduce solutions before validating problem pain points. Building upon Rhetorical Structure Theory, Peldszus &amp; Stede (2013) [5], Stab &amp; Gurevych (2014) [6], and Li et al. (2021) [7] modeled persuasive text as argument dependency graphs. While theoretically rigorous, their recursive neural parsing requires heavy GPU compute, making low-latency client-side execution infeasible.</w:t>
+        <w:t>To analyze how arguments are constructed in text, researchers developed Computational Argument Mining. Wachsmuth et al. (2017) [4] categorized arguments into logical, rhetorical, and dialectical quality, finding that evaluators heavily penalize founders who describe their solution before properly validating the problem pain point. Peldszus and Stede (2013) [5], Stab and Gurevych (2014) [6], and Li et al. (2021) [7] modeled pitch text using argument dependency trees. While theoretically thorough, their neural parsers take several seconds to run on heavy GPU servers, making them too slow for an interactive real-time text editor.</w:t>
       </w:r>
     </w:p>
     <w:p>
@@ -299,7 +299,7 @@
           <w:color w:val="1E293B"/>
           <w:sz w:val="21"/>
         </w:rPr>
-        <w:t>Theme 3: Retrieval-Augmented Generation (RAG) and Case-Based Reasoning (CBR)</w:t>
+        <w:t>Theme 3: Case-Based Reasoning (CBR) and Real-World Benchmark Grounding</w:t>
       </w:r>
     </w:p>
     <w:p>
@@ -314,7 +314,7 @@
           <w:color w:val="1E293B"/>
           <w:sz w:val="20"/>
         </w:rPr>
-        <w:t>Traditional evaluators analyze text in a vacuum without referencing historical commercial precedents. Aamodt &amp; Plaza (1994) [8] formalized Case-Based Reasoning (CBR) as a 4-step cycle: Retrieve, Reuse, Revise, Retain. In deep learning, Lewis et al. (2020) [9], Guu et al. (2020) [10], and Gao et al. (2024) [11] formalized Retrieval-Augmented Generation (RAG), showing that documentary grounding reduces hallucinations by 60%. PitchIQ adapts CBR/RAG directly to client-side edge environments by indexing funded and rejected Shark Tank deal precedents for instant (&lt;10ms) analogous retrieval.</w:t>
+        <w:t>When an experienced investor evaluates a pitch, they immediately compare it to past companies. Aamodt and Plaza (1994) [8] formalized this cognitive process as Case-Based Reasoning (CBR): solving new problems by retrieving, reusing, revising, and retaining past experiences. Lewis et al. (2020) [9], Guu et al. (2020) [10], and Gao et al. (2024) [11] formalized Retrieval-Augmented Generation (RAG), proving that grounding models in external documents cuts hallucinations by over 60%. In PitchIQ, we engineered this precedent-grounding benefit to run in milliseconds directly in the browser using keyword-token matching against a curated database of funded and rejected venture deals.</w:t>
       </w:r>
     </w:p>
     <w:p>
@@ -328,7 +328,7 @@
           <w:color w:val="1E293B"/>
           <w:sz w:val="21"/>
         </w:rPr>
-        <w:t>Theme 4: Automated Writing Evaluation (AWE) and Formative Remediation</w:t>
+        <w:t>Theme 4: Automated Writing Evaluation (AWE) and Formative Feedback</w:t>
       </w:r>
     </w:p>
     <w:p>
@@ -343,7 +343,7 @@
           <w:color w:val="1E293B"/>
           <w:sz w:val="20"/>
         </w:rPr>
-        <w:t>Warschauer &amp; Ware (2006) [12] and Attali &amp; Burstein (2006) [13] proved that summative scoring alone yields near-zero learning retention, while formative feedback pairing error detection with concrete rewrites delivers a 42% higher revision efficacy. Reiter &amp; Dale (2000) [14] and Gatt &amp; Krahmer (2018) [15] demonstrated that in safety-critical and domain-specific applications, template slot-filling Natural Language Generation (NLG) provides 100% semantic coherence, zero hallucinations, and total determinism compared to unconstrained autoregressive generators.</w:t>
+        <w:t>Warschauer and Ware (2006) [12] and Attali and Burstein (2006) [13] evaluated Automated Writing Evaluation systems. Their studies proved that summative feedback (just giving a solitary score like '65/100') does almost nothing to help people learn, while formative feedback (pairing error detection with an actionable rewrite) increases revision efficacy by 42%. Reiter and Dale (2000) [14] and Gatt and Krahmer (2018) [15] demonstrated that template-based slot-filling Natural Language Generation (NLG) is far more reliable for factual domain tasks because it never invents false claims or distorts user numbers.</w:t>
       </w:r>
     </w:p>
     <w:p>
@@ -357,7 +357,7 @@
           <w:color w:val="1E293B"/>
           <w:sz w:val="21"/>
         </w:rPr>
-        <w:t>Theme 5: Generative LLM Sycophancy, Temperature Instability, and Evaluator Bias</w:t>
+        <w:t>Theme 5: Why Standard LLMs Fall Short as Pitch Evaluators</w:t>
       </w:r>
     </w:p>
     <w:p>
@@ -372,7 +372,7 @@
           <w:color w:val="1E293B"/>
           <w:sz w:val="20"/>
         </w:rPr>
-        <w:t>Sharma et al. (2023) [16] demonstrated that RLHF alignment induces sycophancy in LLMs: models routinely validate user bias and generate polite praise rather than objective critique. Wei et al. (2023) [17], Chen &amp; Patel (2024) [18], and Zheng et al. (2023) [19] showed that stochastic temperature generation creates score variations of ±18 points across identical scripts, along with verbosity bias, making unconstrained LLMs unsuitable for fair standardized grading.</w:t>
+        <w:t>Sharma et al. (2023) [16] proved that RLHF causes LLMs to become sycophantic—flattering the user with polite praise rather than highlighting fatal financial flaws. Wei et al. (2023) [17] and Chen and Patel (2024) [18] showed that temperature sampling causes score variations of ±18 points on identical scripts. Zheng et al. (2023) [19] found that LLM judges systematically favor long, wordy answers, whereas an elevator pitch requires extreme brevity.</w:t>
       </w:r>
     </w:p>
     <w:p>
@@ -386,7 +386,7 @@
           <w:color w:val="1E293B"/>
           <w:sz w:val="21"/>
         </w:rPr>
-        <w:t>Theme 6: Deterministic Finite-State Automata and Client-Side Edge Privacy</w:t>
+        <w:t>Theme 6: Rule-Based Determinism, Speed, and User Privacy</w:t>
       </w:r>
     </w:p>
     <w:p>
@@ -401,7 +401,7 @@
           <w:color w:val="1E293B"/>
           <w:sz w:val="20"/>
         </w:rPr>
-        <w:t>Manning &amp; Schütze (1999) [20] proved that for domain-constrained structural text classification, deterministic regular expression state machines provide 100% reproducible scoring, sub-millisecond execution, and zero memory overhead. Coupled with browser-native IndexedDB and Edge deployment, this guarantees zero data leakage of proprietary business concepts.</w:t>
+        <w:t>Manning and Schütze (1999) [20] showed that for well-defined structural formats like elevator pitches, deterministic regular expressions and state machines execute in under a millisecond, cost nothing in server bills, and give 100% reproducible scores. By running all logic client-side and storing pitch history locally in IndexedDB, user ideas remain 100% private.</w:t>
       </w:r>
     </w:p>
     <w:p>
@@ -715,7 +715,7 @@
                 <w:rFonts w:ascii="Arial" w:hAnsi="Arial"/>
                 <w:sz w:val="13"/>
               </w:rPr>
-              <w:t>Acoustic signal processing, cadence, pitch modulation</w:t>
+              <w:t>Audio signal processing, cadence, pitch modulation</w:t>
             </w:r>
           </w:p>
         </w:tc>
@@ -735,7 +735,7 @@
                 <w:rFonts w:ascii="Arial" w:hAnsi="Arial"/>
                 <w:sz w:val="13"/>
               </w:rPr>
-              <w:t>Real-time pacing feedback; boosts confidence by 35%</w:t>
+              <w:t>Real-time pacing cues; boosts confidence by 35%</w:t>
             </w:r>
           </w:p>
         </w:tc>
@@ -755,7 +755,7 @@
                 <w:rFonts w:ascii="Arial" w:hAnsi="Arial"/>
                 <w:sz w:val="13"/>
               </w:rPr>
-              <w:t>Content-blind; cannot assess business logic or margins</w:t>
+              <w:t>Ignores what speaker says; content-blind</w:t>
             </w:r>
           </w:p>
         </w:tc>
@@ -775,7 +775,7 @@
                 <w:rFonts w:ascii="Arial" w:hAnsi="Arial"/>
                 <w:sz w:val="13"/>
               </w:rPr>
-              <w:t>Content-first semantic parser analyzing venture milestones</w:t>
+              <w:t>Evaluates content: hook brevity, problem clarity, metrics, asks</w:t>
             </w:r>
           </w:p>
         </w:tc>
@@ -877,7 +877,7 @@
                 <w:rFonts w:ascii="Arial" w:hAnsi="Arial"/>
                 <w:sz w:val="13"/>
               </w:rPr>
-              <w:t>Computer vision gaze tracking + audio prosody</w:t>
+              <w:t>Computer vision eye gaze + audio prosody in VR</w:t>
             </w:r>
           </w:p>
         </w:tc>
@@ -897,7 +897,7 @@
                 <w:rFonts w:ascii="Arial" w:hAnsi="Arial"/>
                 <w:sz w:val="13"/>
               </w:rPr>
-              <w:t>Physical posture and vocal delivery assessment in VR</w:t>
+              <w:t>Effective physical delivery and eye-contact tracking</w:t>
             </w:r>
           </w:p>
         </w:tc>
@@ -917,7 +917,7 @@
                 <w:rFonts w:ascii="Arial" w:hAnsi="Arial"/>
                 <w:sz w:val="13"/>
               </w:rPr>
-              <w:t>Requires webcam/mic; heavy compute; ignores script text</w:t>
+              <w:t>Requires camera/mic; ignores business logic</w:t>
             </w:r>
           </w:p>
         </w:tc>
@@ -937,7 +937,7 @@
                 <w:rFonts w:ascii="Arial" w:hAnsi="Arial"/>
                 <w:sz w:val="13"/>
               </w:rPr>
-              <w:t>Lightweight, text-first diagnostic requiring zero special hardware</w:t>
+              <w:t>Text-first diagnostic requiring zero special hardware</w:t>
             </w:r>
           </w:p>
         </w:tc>
@@ -1039,7 +1039,7 @@
                 <w:rFonts w:ascii="Arial" w:hAnsi="Arial"/>
                 <w:sz w:val="13"/>
               </w:rPr>
-              <w:t>Bag-of-words (BoW) &amp; TF-IDF keyword modeling</w:t>
+              <w:t>Bag-of-words (BoW) &amp; TF-IDF keyword counting</w:t>
             </w:r>
           </w:p>
         </w:tc>
@@ -1079,7 +1079,7 @@
                 <w:rFonts w:ascii="Arial" w:hAnsi="Arial"/>
                 <w:sz w:val="13"/>
               </w:rPr>
-              <w:t>Lacks syntactic awareness; misses rhetorical narrative flow</w:t>
+              <w:t>Misses narrative sequence and calls-to-action</w:t>
             </w:r>
           </w:p>
         </w:tc>
@@ -1099,7 +1099,7 @@
                 <w:rFonts w:ascii="Arial" w:hAnsi="Arial"/>
                 <w:sz w:val="13"/>
               </w:rPr>
-              <w:t>Deterministic regex state machine tracking 6 rhetorical milestones</w:t>
+              <w:t>Deterministic state machine verifying 6 rhetorical milestones</w:t>
             </w:r>
           </w:p>
         </w:tc>
@@ -1221,7 +1221,7 @@
                 <w:rFonts w:ascii="Arial" w:hAnsi="Arial"/>
                 <w:sz w:val="13"/>
               </w:rPr>
-              <w:t>Taxonomy of logical, rhetorical, and dialectical quality</w:t>
+              <w:t>Taxonomy of logical, rhetorical, dialectical quality</w:t>
             </w:r>
           </w:p>
         </w:tc>
@@ -1241,7 +1241,7 @@
                 <w:rFonts w:ascii="Arial" w:hAnsi="Arial"/>
                 <w:sz w:val="13"/>
               </w:rPr>
-              <w:t>Heavy offline batch pipeline; zero dynamic script rewrite</w:t>
+              <w:t>Heavy batch pipeline; zero dynamic script rewrite</w:t>
             </w:r>
           </w:p>
         </w:tc>
@@ -1403,7 +1403,7 @@
                 <w:rFonts w:ascii="Arial" w:hAnsi="Arial"/>
                 <w:sz w:val="13"/>
               </w:rPr>
-              <w:t>High failure rate on informal, conversational elevator pitches</w:t>
+              <w:t>Fails on informal, fast conversational pitches</w:t>
             </w:r>
           </w:p>
         </w:tc>
@@ -1565,7 +1565,7 @@
                 <w:rFonts w:ascii="Arial" w:hAnsi="Arial"/>
                 <w:sz w:val="13"/>
               </w:rPr>
-              <w:t>Overfitted to academic essays; fails on commercial metrics</w:t>
+              <w:t>Overfitted to essays; fails on business metrics</w:t>
             </w:r>
           </w:p>
         </w:tc>
@@ -1585,7 +1585,7 @@
                 <w:rFonts w:ascii="Arial" w:hAnsi="Arial"/>
                 <w:sz w:val="13"/>
               </w:rPr>
-              <w:t>Specialized venture taxonomy for ARR, margins, CAC, and asks</w:t>
+              <w:t>Venture taxonomy for ARR, margins, CAC, and asks</w:t>
             </w:r>
           </w:p>
         </w:tc>
@@ -1707,7 +1707,7 @@
                 <w:rFonts w:ascii="Arial" w:hAnsi="Arial"/>
                 <w:sz w:val="13"/>
               </w:rPr>
-              <w:t>Captures rhetorical transitions across pitch decks</w:t>
+              <w:t>Captures rhetorical transitions across slide decks</w:t>
             </w:r>
           </w:p>
         </w:tc>
@@ -1727,7 +1727,7 @@
                 <w:rFonts w:ascii="Arial" w:hAnsi="Arial"/>
                 <w:sz w:val="13"/>
               </w:rPr>
-              <w:t>Requires GPU servers; multi-second latency; black-box</w:t>
+              <w:t>Requires GPU servers; multi-second latency</w:t>
             </w:r>
           </w:p>
         </w:tc>
@@ -1747,7 +1747,7 @@
                 <w:rFonts w:ascii="Arial" w:hAnsi="Arial"/>
                 <w:sz w:val="13"/>
               </w:rPr>
-              <w:t>Sub-millisecond client-side regex pipeline with zero cloud GPU</w:t>
+              <w:t>Sub-millisecond client-side regex pipeline with zero GPU</w:t>
             </w:r>
           </w:p>
         </w:tc>
@@ -1869,7 +1869,7 @@
                 <w:rFonts w:ascii="Arial" w:hAnsi="Arial"/>
                 <w:sz w:val="13"/>
               </w:rPr>
-              <w:t>Interpretable; mirrors human expert diagnostic reasoning</w:t>
+              <w:t>Interpretable; mirrors human investor thinking</w:t>
             </w:r>
           </w:p>
         </w:tc>
@@ -1909,7 +1909,7 @@
                 <w:rFonts w:ascii="Arial" w:hAnsi="Arial"/>
                 <w:sz w:val="13"/>
               </w:rPr>
-              <w:t>Fast Jaccard keyword retrieval over indexed venture deal corpus</w:t>
+              <w:t>Fast Jaccard keyword retrieval over indexed deal corpus</w:t>
             </w:r>
           </w:p>
         </w:tc>
@@ -2051,7 +2051,7 @@
                 <w:rFonts w:ascii="Arial" w:hAnsi="Arial"/>
                 <w:sz w:val="13"/>
               </w:rPr>
-              <w:t>Multi-GB vector DBs; GPU hosting overhead; high costs</w:t>
+              <w:t>Multi-GB vector DBs; GPU hosting overhead</w:t>
             </w:r>
           </w:p>
         </w:tc>
@@ -2193,7 +2193,7 @@
                 <w:rFonts w:ascii="Arial" w:hAnsi="Arial"/>
                 <w:sz w:val="13"/>
               </w:rPr>
-              <w:t>Open-domain QA with verified documentary citation</w:t>
+              <w:t>Open-domain QA with verified documentary citations</w:t>
             </w:r>
           </w:p>
         </w:tc>
@@ -2213,7 +2213,7 @@
                 <w:rFonts w:ascii="Arial" w:hAnsi="Arial"/>
                 <w:sz w:val="13"/>
               </w:rPr>
-              <w:t>Black-box weights; massive pre-training cost</w:t>
+              <w:t>Black-box weights; massive training cost</w:t>
             </w:r>
           </w:p>
         </w:tc>
@@ -2233,7 +2233,7 @@
                 <w:rFonts w:ascii="Arial" w:hAnsi="Arial"/>
                 <w:sz w:val="13"/>
               </w:rPr>
-              <w:t>Transparent deterministic ranking with explicit similarity metrics</w:t>
+              <w:t>Transparent deterministic ranking with explicit similarity scores</w:t>
             </w:r>
           </w:p>
         </w:tc>
@@ -2295,7 +2295,7 @@
                 <w:rFonts w:ascii="Arial" w:hAnsi="Arial"/>
                 <w:sz w:val="13"/>
               </w:rPr>
-              <w:t>RAG for LLMs: A Survey (IEEE TKDE)</w:t>
+              <w:t>RAG for Large Language Models: A Survey (IEEE TKDE)</w:t>
             </w:r>
           </w:p>
         </w:tc>
@@ -2497,7 +2497,7 @@
                 <w:rFonts w:ascii="Arial" w:hAnsi="Arial"/>
                 <w:sz w:val="13"/>
               </w:rPr>
-              <w:t>Formative vs. summative diagnostic feedback comparison</w:t>
+              <w:t>Formative vs. summative feedback comparison</w:t>
             </w:r>
           </w:p>
         </w:tc>
@@ -2537,7 +2537,7 @@
                 <w:rFonts w:ascii="Arial" w:hAnsi="Arial"/>
                 <w:sz w:val="13"/>
               </w:rPr>
-              <w:t>Focuses on generic school grammar, not commercial persuasion</w:t>
+              <w:t>Focused on school essay grammar, not persuasion</w:t>
             </w:r>
           </w:p>
         </w:tc>
@@ -3509,7 +3509,7 @@
                 <w:rFonts w:ascii="Arial" w:hAnsi="Arial"/>
                 <w:sz w:val="13"/>
               </w:rPr>
-              <w:t>Cloud API latency (3-8s); token costs; +-18 pt fluctuation</w:t>
+              <w:t>Cloud API latency (3-8s); token costs; +-18 pt drift</w:t>
             </w:r>
           </w:p>
         </w:tc>
@@ -3671,7 +3671,7 @@
                 <w:rFonts w:ascii="Arial" w:hAnsi="Arial"/>
                 <w:sz w:val="13"/>
               </w:rPr>
-              <w:t>LLM judges systematically favor long-winded responses</w:t>
+              <w:t>LLM judges systematically favor long-winded answers</w:t>
             </w:r>
           </w:p>
         </w:tc>
@@ -3875,7 +3875,7 @@
           <w:color w:val="801818"/>
           <w:sz w:val="24"/>
         </w:rPr>
-        <w:t>4. In-Depth Research Gap Analysis</w:t>
+        <w:t>4. Key Research Gaps Identified</w:t>
       </w:r>
     </w:p>
     <w:p>
@@ -3888,14 +3888,14 @@
           <w:color w:val="801818"/>
           <w:sz w:val="19"/>
         </w:rPr>
-        <w:t xml:space="preserve">• Gap 1: The Prosody-Semantics Divide (Content Blindness): </w:t>
+        <w:t xml:space="preserve">• Gap 1: Delivery Tools Ignore Content (The Prosody-Semantics Gap): </w:t>
       </w:r>
       <w:r>
         <w:rPr>
           <w:rFonts w:ascii="Times New Roman" w:hAnsi="Times New Roman"/>
           <w:sz w:val="19"/>
         </w:rPr>
-        <w:t>Current commercial speech coaches (Yoodli, Speeko) focus on acoustic metrics (pacing, filler words, volume) and facial gestures. PitchIQ resolves this with a content-first analysis engine tailored to venture funding communication.</w:t>
+        <w:t>Existing speech coaching apps like Yoodli or Speeko only analyze pacing, filler words, and vocal modulation. They cannot tell whether a pitch actually makes business sense or if the founder asked for an investment.</w:t>
       </w:r>
     </w:p>
     <w:p>
@@ -3908,14 +3908,14 @@
           <w:color w:val="801818"/>
           <w:sz w:val="19"/>
         </w:rPr>
-        <w:t xml:space="preserve">• Gap 2: Hallucination, Sycophancy, and Temperature Noise in LLM Evaluators: </w:t>
+        <w:t xml:space="preserve">• Gap 2: Generative LLMs Are Inconsistent and Overly Flattering: </w:t>
       </w:r>
       <w:r>
         <w:rPr>
           <w:rFonts w:ascii="Times New Roman" w:hAnsi="Times New Roman"/>
           <w:sz w:val="19"/>
         </w:rPr>
-        <w:t>LLMs suffer from sycophancy, excessive polite affirmations, and temperature score drift (+-18 points). PitchIQ enforces a 100% deterministic, unsycophantic 6-axis mathematical rubric.</w:t>
+        <w:t>General-purpose AI chatbots suffer from sycophancy (flattering the user instead of providing candid critique) and stochastic temperature drift (+-18 points on identical scripts), making them unreliable for objective evaluation.</w:t>
       </w:r>
     </w:p>
     <w:p>
@@ -3928,14 +3928,14 @@
           <w:color w:val="801818"/>
           <w:sz w:val="19"/>
         </w:rPr>
-        <w:t xml:space="preserve">• Gap 3: Absence of Case-Based Grounding in Pitch Analysis: </w:t>
+        <w:t xml:space="preserve">• Gap 3: Lack of Real-World Precedent Grounding: </w:t>
       </w:r>
       <w:r>
         <w:rPr>
           <w:rFonts w:ascii="Times New Roman" w:hAnsi="Times New Roman"/>
           <w:sz w:val="19"/>
         </w:rPr>
-        <w:t>Existing AWE platforms test text in a vacuum without analogous deal precedents. PitchIQ integrates an embedded RAG module indexing verified funded and rejected venture benchmarks.</w:t>
+        <w:t>Most writing analysis tools evaluate text in a vacuum without referencing real-world commercial outcomes. In venture capital, pitches succeed based on how they compare to historical precedent deals.</w:t>
       </w:r>
     </w:p>
     <w:p>
@@ -3948,14 +3948,14 @@
           <w:color w:val="801818"/>
           <w:sz w:val="19"/>
         </w:rPr>
-        <w:t xml:space="preserve">• Gap 4: Compute Latency, Operational Cost, and IP Privacy: </w:t>
+        <w:t xml:space="preserve">• Gap 4: Cloud Latency, API Costs, and IP Privacy Concerns: </w:t>
       </w:r>
       <w:r>
         <w:rPr>
           <w:rFonts w:ascii="Times New Roman" w:hAnsi="Times New Roman"/>
           <w:sz w:val="19"/>
         </w:rPr>
-        <w:t>Cloud GPU pipelines introduce 3-8s latency, recurring API costs, and data leakage of confidential startup ideas. PitchIQ executes entirely client-side with zero data egress.</w:t>
+        <w:t>Modern neural NLP pipelines require cloud GPUs and remote APIs, introducing 3-8s latency and forcing users to upload confidential startup concepts to external servers.</w:t>
       </w:r>
     </w:p>
     <w:p>
@@ -3968,14 +3968,14 @@
           <w:color w:val="801818"/>
           <w:sz w:val="19"/>
         </w:rPr>
-        <w:t xml:space="preserve">• Gap 5: Summative Grading vs. Formative Slot-Filling Remediation: </w:t>
+        <w:t xml:space="preserve">• Gap 5: Abstract Scores Without Actionable Rewrites: </w:t>
       </w:r>
       <w:r>
         <w:rPr>
           <w:rFonts w:ascii="Times New Roman" w:hAnsi="Times New Roman"/>
           <w:sz w:val="19"/>
         </w:rPr>
-        <w:t>Providing abstract numerical scores alone yields negligible skill retention. PitchIQ incorporates a dynamic slot-filling NLG engine that synthesizes an upgraded, product-specific 5-step elevator pitch.</w:t>
+        <w:t>Telling a user that their pitch scored 62/100 does not help them fix it. People only improve when shown concrete, formative rewrites that directly demonstrate how to fix the identified flaws.</w:t>
       </w:r>
     </w:p>
     <w:p>
@@ -3989,7 +3989,7 @@
           <w:color w:val="801818"/>
           <w:sz w:val="24"/>
         </w:rPr>
-        <w:t>5. Architectural Inferences &amp; Algorithmic Formulation of PitchIQ</w:t>
+        <w:t>5. How PitchIQ Addresses These Gaps</w:t>
       </w:r>
     </w:p>
     <w:p>
@@ -4004,7 +4004,7 @@
           <w:color w:val="1E293B"/>
           <w:sz w:val="20"/>
         </w:rPr>
-        <w:t>The findings from this literature survey directly define PitchIQ's algorithmic pipeline:</w:t>
+        <w:t>We used the insights from our literature survey to design and engineer PitchIQ:</w:t>
       </w:r>
     </w:p>
     <w:p>
@@ -4019,7 +4019,7 @@
           <w:color w:val="1E293B"/>
           <w:sz w:val="20"/>
         </w:rPr>
-        <w:t>1. Deterministic 6-Axis Rubric: Evaluates Clarity, Hook Brevity, Rhetorical Structure, Persuasion (traction &amp; moats), Call-to-Action, and Confidence. Scores adapt dynamically across four audience contexts (Investors, Enterprise B2B, SMB, General).</w:t>
+        <w:t>1. Deterministic 6-Axis Evaluation Rubric: Evaluates Clarity, Hook Quality (&lt;=12 words), Structure (Problem -&gt; Solution -&gt; Traction -&gt; CTA), Persuasiveness (metrics &amp; moats), Call-to-Action, and Confidence. Scores adapt dynamically across four audience contexts (Investors, Enterprise B2B, SMB, General).</w:t>
       </w:r>
     </w:p>
     <w:p>
@@ -4034,7 +4034,7 @@
           <w:color w:val="1E293B"/>
           <w:sz w:val="20"/>
         </w:rPr>
-        <w:t>2. Case-Based Retrieval Precedent Engine (CBR/RAG): Computes Jaccard keyword overlap to retrieve a Funded Benchmark Deal and a Cautionary Rejected Case.</w:t>
+        <w:t>2. Case-Based Deal Precedent Matching (Client-Side RAG): Indexes a database of real-world Shark Tank venture deals to retrieve a Funded Benchmark Deal and a Cautionary Rejected Deal in under 10ms.</w:t>
       </w:r>
     </w:p>
     <w:p>
@@ -4049,7 +4049,7 @@
           <w:color w:val="1E293B"/>
           <w:sz w:val="20"/>
         </w:rPr>
-        <w:t>3. Hallucination-Free Slot-Filling NLG: Extracts entities (Speaker, Company, Problem, Solution, Traction) and constructs a high-impact 5-step elevator pitch.</w:t>
+        <w:t>3. Hallucination-Free Slot-Filling Rewrite Engine: Extracts domain entities (Speaker, Company, Problem, Solution, Metrics) and constructs a structured, punchy 5-step elevator pitch with zero hallucinations.</w:t>
       </w:r>
     </w:p>
     <w:p>
@@ -4064,7 +4064,7 @@
           <w:color w:val="1E293B"/>
           <w:sz w:val="20"/>
         </w:rPr>
-        <w:t>4. Zero-Latency Client-Side Persistence: IndexedDB storage ensures that multi-attempt progression tracking and pitch history are private, isolated, and instant.</w:t>
+        <w:t>4. 100% Client-Side Execution &amp; Privacy: The entire parsing, scoring, and rewrite pipeline executes in JavaScript directly inside the browser. Multi-attempt pitch history is stored locally using IndexedDB, guaranteeing instant response times and total privacy.</w:t>
       </w:r>
     </w:p>
     <w:p>
@@ -4078,7 +4078,7 @@
           <w:color w:val="801818"/>
           <w:sz w:val="24"/>
         </w:rPr>
-        <w:t>6. Comparative Advantage of PitchIQ</w:t>
+        <w:t>6. How PitchIQ Compares with Existing Solutions</w:t>
       </w:r>
     </w:p>
     <w:tbl>
@@ -4171,7 +4171,7 @@
                 <w:color w:val="FFFFFF"/>
                 <w:sz w:val="15"/>
               </w:rPr>
-              <w:t>PitchIQ Platform</w:t>
+              <w:t>PitchIQ Platform (Our Project)</w:t>
             </w:r>
           </w:p>
         </w:tc>
@@ -4186,7 +4186,7 @@
               <w:rPr>
                 <w:sz w:val="14"/>
               </w:rPr>
-              <w:t>Cost per Evaluation</w:t>
+              <w:t>Cost</w:t>
             </w:r>
           </w:p>
         </w:tc>
@@ -4255,7 +4255,7 @@
               <w:rPr>
                 <w:sz w:val="14"/>
               </w:rPr>
-              <w:t>Response Latency</w:t>
+              <w:t>Response Time</w:t>
             </w:r>
           </w:p>
         </w:tc>
@@ -4324,7 +4324,7 @@
               <w:rPr>
                 <w:sz w:val="14"/>
               </w:rPr>
-              <w:t>Unit Economics Analysis</w:t>
+              <w:t>Content &amp; Unit Economics</w:t>
             </w:r>
           </w:p>
         </w:tc>
@@ -4419,7 +4419,7 @@
               <w:rPr>
                 <w:sz w:val="14"/>
               </w:rPr>
-              <w:t>Consistent (Acoustic)</w:t>
+              <w:t>Consistent (Audio)</w:t>
             </w:r>
           </w:p>
         </w:tc>
@@ -4432,7 +4432,7 @@
               <w:rPr>
                 <w:sz w:val="14"/>
               </w:rPr>
-              <w:t>Stochastic (+-18 pts)</w:t>
+              <w:t>Inconsistent (+-18 pts)</w:t>
             </w:r>
           </w:p>
         </w:tc>
@@ -4447,7 +4447,7 @@
                 <w:color w:val="801818"/>
                 <w:sz w:val="14"/>
               </w:rPr>
-              <w:t>100% Deterministic</w:t>
+              <w:t>100% Deterministic &amp; Reproducible</w:t>
             </w:r>
           </w:p>
         </w:tc>
@@ -4516,7 +4516,7 @@
                 <w:color w:val="801818"/>
                 <w:sz w:val="14"/>
               </w:rPr>
-              <w:t>High (Strict venture hurdles)</w:t>
+              <w:t>High (Strict venture criteria)</w:t>
             </w:r>
           </w:p>
         </w:tc>
@@ -4531,7 +4531,7 @@
               <w:rPr>
                 <w:sz w:val="14"/>
               </w:rPr>
-              <w:t>Venture Grounding (CBR)</w:t>
+              <w:t>Real Deal Precedents (CBR)</w:t>
             </w:r>
           </w:p>
         </w:tc>
@@ -4585,7 +4585,7 @@
                 <w:color w:val="801818"/>
                 <w:sz w:val="14"/>
               </w:rPr>
-              <w:t>Curated Deal Corpus</w:t>
+              <w:t>Curated Funded &amp; Rejected Deals</w:t>
             </w:r>
           </w:p>
         </w:tc>
@@ -4600,7 +4600,7 @@
               <w:rPr>
                 <w:sz w:val="14"/>
               </w:rPr>
-              <w:t>Formative Dynamic Rewrite</w:t>
+              <w:t>Upgraded Script Rewrite</w:t>
             </w:r>
           </w:p>
         </w:tc>
@@ -4613,7 +4613,7 @@
               <w:rPr>
                 <w:sz w:val="14"/>
               </w:rPr>
-              <w:t>Manual</w:t>
+              <w:t>Manual / Slow</w:t>
             </w:r>
           </w:p>
         </w:tc>
@@ -4669,7 +4669,7 @@
               <w:rPr>
                 <w:sz w:val="14"/>
               </w:rPr>
-              <w:t>Data Privacy &amp; IP Protection</w:t>
+              <w:t>User Privacy</w:t>
             </w:r>
           </w:p>
         </w:tc>
@@ -4682,7 +4682,7 @@
               <w:rPr>
                 <w:sz w:val="14"/>
               </w:rPr>
-              <w:t>NDA required</w:t>
+              <w:t>Requires NDA</w:t>
             </w:r>
           </w:p>
         </w:tc>
@@ -4723,7 +4723,76 @@
                 <w:color w:val="801818"/>
                 <w:sz w:val="14"/>
               </w:rPr>
-              <w:t>100% Client-Side Local</w:t>
+              <w:t>100% Client-Side Local Storage</w:t>
+            </w:r>
+          </w:p>
+        </w:tc>
+      </w:tr>
+      <w:tr>
+        <w:tc>
+          <w:tcPr>
+            <w:tcW w:type="dxa" w:w="1987"/>
+          </w:tcPr>
+          <w:p>
+            <w:r>
+              <w:rPr>
+                <w:sz w:val="14"/>
+              </w:rPr>
+              <w:t>Offline / Edge Availability</w:t>
+            </w:r>
+          </w:p>
+        </w:tc>
+        <w:tc>
+          <w:tcPr>
+            <w:tcW w:type="dxa" w:w="1987"/>
+          </w:tcPr>
+          <w:p>
+            <w:r>
+              <w:rPr>
+                <w:sz w:val="14"/>
+              </w:rPr>
+              <w:t>No</w:t>
+            </w:r>
+          </w:p>
+        </w:tc>
+        <w:tc>
+          <w:tcPr>
+            <w:tcW w:type="dxa" w:w="1987"/>
+          </w:tcPr>
+          <w:p>
+            <w:r>
+              <w:rPr>
+                <w:sz w:val="14"/>
+              </w:rPr>
+              <w:t>No</w:t>
+            </w:r>
+          </w:p>
+        </w:tc>
+        <w:tc>
+          <w:tcPr>
+            <w:tcW w:type="dxa" w:w="1987"/>
+          </w:tcPr>
+          <w:p>
+            <w:r>
+              <w:rPr>
+                <w:sz w:val="14"/>
+              </w:rPr>
+              <w:t>No</w:t>
+            </w:r>
+          </w:p>
+        </w:tc>
+        <w:tc>
+          <w:tcPr>
+            <w:tcW w:type="dxa" w:w="1987"/>
+          </w:tcPr>
+          <w:p>
+            <w:r>
+              <w:rPr>
+                <w:b/>
+                <w:color w:val="801818"/>
+                <w:sz w:val="14"/>
+              </w:rPr>
+              <w:t>Full Browser / Edge Execution</w:t>
             </w:r>
           </w:p>
         </w:tc>
@@ -4760,7 +4829,22 @@
           <w:color w:val="1E293B"/>
           <w:sz w:val="20"/>
         </w:rPr>
-        <w:t>This updated literature survey demonstrates that while acoustic speech tools and generative LLMs offer notable capabilities, they fail to provide objective, candid, content-grounded, private, and accessible pitch coaching. By uniting deterministic semantic parsing, case-based venture retrieval, and hallucination-free natural language generation in a modern client-side React architecture, PitchIQ directly bridges these critical research gaps.</w:t>
+        <w:t>This literature survey has systematically reviewed 20 foundational research papers across speech coaching, computational argument mining, retrieval-augmented generation, automated writing evaluation, and large language model evaluation anomalies. The research makes it clear that while acoustic speech coaches and general-purpose LLMs are impressive in their own domains, they do not provide objective, candid, content-grounded, and private coaching specifically tailored for entrepreneurial elevator pitches.</w:t>
+      </w:r>
+    </w:p>
+    <w:p>
+      <w:pPr>
+        <w:spacing w:after="120"/>
+        <w:ind w:firstLine="360"/>
+        <w:jc w:val="both"/>
+      </w:pPr>
+      <w:r>
+        <w:rPr>
+          <w:rFonts w:ascii="Times New Roman" w:hAnsi="Times New Roman"/>
+          <w:color w:val="1E293B"/>
+          <w:sz w:val="20"/>
+        </w:rPr>
+        <w:t>By combining deterministic semantic parsing, case-based deal precedent retrieval, multi-perspective investor simulation, and hallucination-free slot-filling natural language generation into a responsive React web application, PitchIQ directly bridges these research gaps. The resulting platform delivers instant, consistent, and actionable pitch coaching suitable for college capstone evaluations, startup incubators, and sales enablement.</w:t>
       </w:r>
     </w:p>
     <w:p>

</xml_diff>